<commit_message>
feat: tach Yeu cau xuat kho / Phieu xuat kho, cai thien UI
- Tach chuc nang Sale (yeu cau xuat kho) khoi phieu xuat kho (kho/QL)
- Backend: model DeliveryRequest, controller, routes /delivery-requests
- Frontend: trang DeliveryRequestsPage, route, sidebar muc moi
- Chi cho phep sua noi dung phieu khi trang thai Nhap (backend + frontend)
- Phieu xuat hien cot 'Tu yeu cau' khi tao tu yeu cau Sale
- UserManagementPage: 5 cot, tim kiem khong dau, bo loc role/trang thai
- DashboardPage: bo 4 card xanh, Quick Actions, bang hoat dong gan day
- WarehouseStructurePage: sua loi zone hien thi 2 lan
- ReportsPage: sua NaN do MySQL DECIMAL tra ve string
- Permissions: them delivery-request:read/create, cap nhat quyen role
- Migration: tao bang DeliveryRequests, them cot requestId vao Deliveries

Co-Authored-By: Claude Sonnet 4.6 <noreply@anthropic.com>
</commit_message>
<xml_diff>
--- a/Chương 3 - khái niệm.docx
+++ b/Chương 3 - khái niệm.docx
@@ -350,7 +350,7 @@
           <w:szCs w:val="26"/>
           <w:rtl w:val="0"/>
         </w:rPr>
-        <w:t xml:space="preserve">SanPham (Ma_san_pham, Ten_san_pham, Ma_barcode, Mo_ta, Don_vi_tinh, Trong_luong, Gia_san_xuat, Gia_ban, Quan_ly_theo_serial, Trang_thai, Thoi_gian_tao, Thoi_gian_cap_nhat)</w:t>
+        <w:t>SanPham (Ma_san_pham, Ten_san_pham, Ma_barcode, Mo_ta, Don_vi_tinh, Trong_luong, Gia_san_xuat, Gia_ban, Quan_ly_theo_serial, Trang_thai, Thoi_gian_tao, Thoi_gian_cap_nhat, ⭐ Thoi_han_bao_hanh)</w:t>
       </w:r>
     </w:p>
     <w:p>
@@ -375,7 +375,7 @@
           <w:szCs w:val="26"/>
           <w:rtl w:val="0"/>
         </w:rPr>
-        <w:t xml:space="preserve">SoSerial (Ma_serial, Trang_thai, Ngay_san_xuat, Ghi_chu, Thoi_gian_tao, Thoi_gian_cap_nhat)</w:t>
+        <w:t>SoSerial (Ma_serial, Trang_thai, Ngay_san_xuat, Ghi_chu, Thoi_gian_tao, Thoi_gian_cap_nhat, ⭐ Ma_lo, ⭐ Han_bao_hanh)</w:t>
       </w:r>
     </w:p>
     <w:p>
@@ -576,6 +576,44 @@
           <w:rtl w:val="0"/>
         </w:rPr>
         <w:t xml:space="preserve">PhieuDieuChinhTonKho (Ma_phieu_dieu_chinh, Ngay_lap, Ly_do_dieu_chinh, Ghi_chu, Trang_thai, Thoi_gian_tao, Thoi_gian_cap_nhat)</w:t>
+      </w:r>
+    </w:p>
+    <w:p>
+      <w:pPr>
+        <w:numPr>
+          <w:ilvl w:val="0"/>
+          <w:numId w:val="1"/>
+        </w:numPr>
+        <w:spacing w:after="240" w:before="240" w:line="240" w:lineRule="auto"/>
+        <w:ind w:left="720" w:hanging="360"/>
+        <w:jc w:val="both"/>
+        <w:rPr>
+          <w:rFonts w:ascii="Times New Roman" w:cs="Times New Roman" w:eastAsia="Times New Roman" w:hAnsi="Times New Roman"/>
+          <w:sz w:val="26"/>
+          <w:szCs w:val="26"/>
+        </w:rPr>
+      </w:pPr>
+      <w:r>
+        <w:t>NhatKyEmail (Ma_nhat_ky, Loai_email, Email_nguoi_nhan, Tieu_de, Trang_thai, Thong_bao_loi, Ma_nguoi_dung, Nguoi_trigger, Thoi_gian_tao, ⭐ Ma_san_pham, ⭐ Ma_vi_tri, ⭐ Da_xu_ly)</w:t>
+      </w:r>
+    </w:p>
+    <w:p>
+      <w:pPr>
+        <w:numPr>
+          <w:ilvl w:val="0"/>
+          <w:numId w:val="1"/>
+        </w:numPr>
+        <w:spacing w:after="240" w:before="240" w:line="240" w:lineRule="auto"/>
+        <w:ind w:left="720" w:hanging="360"/>
+        <w:jc w:val="both"/>
+        <w:rPr>
+          <w:rFonts w:ascii="Times New Roman" w:cs="Times New Roman" w:eastAsia="Times New Roman" w:hAnsi="Times New Roman"/>
+          <w:sz w:val="26"/>
+          <w:szCs w:val="26"/>
+        </w:rPr>
+      </w:pPr>
+      <w:r>
+        <w:t>⭐ LoSanXuat (Ma_lo, Ma_san_pham, So_lo_nha_may, Ngay_san_xuat, So_luong_san_xuat, Nguon_goc, Ghi_chu, Thoi_gian_tao)</w:t>
       </w:r>
     </w:p>
     <w:p>
@@ -850,6 +888,56 @@
           <w:szCs w:val="26"/>
           <w:rtl w:val="0"/>
         </w:rPr>
+        <w:t>⭐ SanPham &lt;Có&gt; LoSanXuat (1:N)</w:t>
+      </w:r>
+    </w:p>
+    <w:p>
+      <w:pPr>
+        <w:numPr>
+          <w:ilvl w:val="0"/>
+          <w:numId w:val="1"/>
+        </w:numPr>
+        <w:spacing w:after="240" w:line="240" w:lineRule="auto"/>
+        <w:ind w:left="720" w:hanging="360"/>
+        <w:jc w:val="both"/>
+        <w:rPr>
+          <w:rFonts w:ascii="Times New Roman" w:cs="Times New Roman" w:eastAsia="Times New Roman" w:hAnsi="Times New Roman"/>
+          <w:sz w:val="26"/>
+          <w:szCs w:val="26"/>
+        </w:rPr>
+      </w:pPr>
+      <w:r>
+        <w:rPr>
+          <w:rFonts w:ascii="Times New Roman" w:cs="Times New Roman" w:eastAsia="Times New Roman" w:hAnsi="Times New Roman"/>
+          <w:sz w:val="26"/>
+          <w:szCs w:val="26"/>
+          <w:rtl w:val="0"/>
+        </w:rPr>
+        <w:t>⭐ LoSanXuat &lt;Chứa&gt; SoSerial (1:N)</w:t>
+      </w:r>
+    </w:p>
+    <w:p>
+      <w:pPr>
+        <w:numPr>
+          <w:ilvl w:val="0"/>
+          <w:numId w:val="1"/>
+        </w:numPr>
+        <w:spacing w:after="240" w:line="240" w:lineRule="auto"/>
+        <w:ind w:left="720" w:hanging="360"/>
+        <w:jc w:val="both"/>
+        <w:rPr>
+          <w:rFonts w:ascii="Times New Roman" w:cs="Times New Roman" w:eastAsia="Times New Roman" w:hAnsi="Times New Roman"/>
+          <w:sz w:val="26"/>
+          <w:szCs w:val="26"/>
+        </w:rPr>
+      </w:pPr>
+      <w:r>
+        <w:rPr>
+          <w:rFonts w:ascii="Times New Roman" w:cs="Times New Roman" w:eastAsia="Times New Roman" w:hAnsi="Times New Roman"/>
+          <w:sz w:val="26"/>
+          <w:szCs w:val="26"/>
+          <w:rtl w:val="0"/>
+        </w:rPr>
         <w:t xml:space="preserve">SanPham &lt;Tồn tại tại&gt; TonKho (N:1)</w:t>
       </w:r>
     </w:p>
@@ -1050,6 +1138,31 @@
           <w:szCs w:val="26"/>
           <w:rtl w:val="0"/>
         </w:rPr>
+        <w:t>⭐ PhieuNhapKho &lt;Ghi nhận&gt; LoSanXuat (N:N) &lt;Ma_lo, So_luong_nhap_lo, Ngay_san_xuat_lo&gt;</w:t>
+      </w:r>
+    </w:p>
+    <w:p>
+      <w:pPr>
+        <w:numPr>
+          <w:ilvl w:val="0"/>
+          <w:numId w:val="1"/>
+        </w:numPr>
+        <w:spacing w:after="240" w:line="240" w:lineRule="auto"/>
+        <w:ind w:left="720" w:hanging="360"/>
+        <w:jc w:val="both"/>
+        <w:rPr>
+          <w:rFonts w:ascii="Times New Roman" w:cs="Times New Roman" w:eastAsia="Times New Roman" w:hAnsi="Times New Roman"/>
+          <w:sz w:val="26"/>
+          <w:szCs w:val="26"/>
+        </w:rPr>
+      </w:pPr>
+      <w:r>
+        <w:rPr>
+          <w:rFonts w:ascii="Times New Roman" w:cs="Times New Roman" w:eastAsia="Times New Roman" w:hAnsi="Times New Roman"/>
+          <w:sz w:val="26"/>
+          <w:szCs w:val="26"/>
+          <w:rtl w:val="0"/>
+        </w:rPr>
         <w:t xml:space="preserve">PhieuNhapKho &lt;Phát sinh&gt; PhieuSuCo (1:N)</w:t>
       </w:r>
     </w:p>
@@ -1551,6 +1664,63 @@
           <w:rtl w:val="0"/>
         </w:rPr>
         <w:t xml:space="preserve">NguoiDung &lt;Xác nhận&gt; PhieuDieuChinhTonKho (1:N)</w:t>
+      </w:r>
+    </w:p>
+    <w:p>
+      <w:pPr>
+        <w:numPr>
+          <w:ilvl w:val="0"/>
+          <w:numId w:val="1"/>
+        </w:numPr>
+        <w:spacing w:after="240" w:line="240" w:lineRule="auto"/>
+        <w:ind w:left="720" w:hanging="360"/>
+        <w:jc w:val="both"/>
+        <w:rPr>
+          <w:rFonts w:ascii="Times New Roman" w:cs="Times New Roman" w:eastAsia="Times New Roman" w:hAnsi="Times New Roman"/>
+          <w:sz w:val="26"/>
+          <w:szCs w:val="26"/>
+        </w:rPr>
+      </w:pPr>
+      <w:r>
+        <w:t xml:space="preserve">NguoiDung &lt;Ghi nhận&gt; NhatKyEmail (1:N)</w:t>
+      </w:r>
+    </w:p>
+    <w:p>
+      <w:pPr>
+        <w:numPr>
+          <w:ilvl w:val="0"/>
+          <w:numId w:val="1"/>
+        </w:numPr>
+        <w:spacing w:after="240" w:line="240" w:lineRule="auto"/>
+        <w:ind w:left="720" w:hanging="360"/>
+        <w:jc w:val="both"/>
+        <w:rPr>
+          <w:rFonts w:ascii="Times New Roman" w:cs="Times New Roman" w:eastAsia="Times New Roman" w:hAnsi="Times New Roman"/>
+          <w:sz w:val="26"/>
+          <w:szCs w:val="26"/>
+        </w:rPr>
+      </w:pPr>
+      <w:r>
+        <w:t>⭐ SanPham &lt;Liên kết&gt; NhatKyEmail (1:N)</w:t>
+      </w:r>
+    </w:p>
+    <w:p>
+      <w:pPr>
+        <w:numPr>
+          <w:ilvl w:val="0"/>
+          <w:numId w:val="1"/>
+        </w:numPr>
+        <w:spacing w:after="240" w:line="240" w:lineRule="auto"/>
+        <w:ind w:left="720" w:hanging="360"/>
+        <w:jc w:val="both"/>
+        <w:rPr>
+          <w:rFonts w:ascii="Times New Roman" w:cs="Times New Roman" w:eastAsia="Times New Roman" w:hAnsi="Times New Roman"/>
+          <w:sz w:val="26"/>
+          <w:szCs w:val="26"/>
+        </w:rPr>
+      </w:pPr>
+      <w:r>
+        <w:t>⭐ ViTriTrongKho &lt;Liên kết&gt; NhatKyEmail (1:N)</w:t>
       </w:r>
     </w:p>
     <w:p>

</xml_diff>